<commit_message>
Update project plan with new objectives, SMART table, and single CPC
Co-Authored-By: Claude Sonnet 5.5 <noreply@anthropic.com>
Claude-Session: https://claude.ai/code/session_01VsHpSoRvB2zeELU5eM1Y8P
</commit_message>
<xml_diff>
--- a/Project_Plan_SUSTAIN_3S03_Ground_Cover.docx
+++ b/Project_Plan_SUSTAIN_3S03_Ground_Cover.docx
@@ -66,7 +66,7 @@
           <w:i w:val="0"/>
           <w:sz w:val="24"/>
         </w:rPr>
-        <w:t>Lead CPC.</w:t>
+        <w:t>Community Project Champion (CPC).</w:t>
       </w:r>
       <w:r>
         <w:rPr>
@@ -76,29 +76,6 @@
           <w:sz w:val="24"/>
         </w:rPr>
         <w:t xml:space="preserve"> Dr. Susan Dudley, Professor, Department of Biology, McMaster University</w:t>
-      </w:r>
-    </w:p>
-    <w:p>
-      <w:pPr>
-        <w:spacing w:after="60" w:before="0" w:line="269" w:lineRule="auto"/>
-      </w:pPr>
-      <w:r>
-        <w:rPr>
-          <w:rFonts w:ascii="Times New Roman" w:hAnsi="Times New Roman" w:eastAsia="Times New Roman"/>
-          <w:b/>
-          <w:i w:val="0"/>
-          <w:sz w:val="24"/>
-        </w:rPr>
-        <w:t>Second CPC.</w:t>
-      </w:r>
-      <w:r>
-        <w:rPr>
-          <w:rFonts w:ascii="Times New Roman" w:hAnsi="Times New Roman" w:eastAsia="Times New Roman"/>
-          <w:b w:val="0"/>
-          <w:i w:val="0"/>
-          <w:sz w:val="24"/>
-        </w:rPr>
-        <w:t xml:space="preserve"> Wayne Terryberry, Coordinator, Natural Lands and Outdoor Recreation, McMaster University</w:t>
       </w:r>
     </w:p>
     <w:p>
@@ -234,7 +211,7 @@
           <w:i w:val="0"/>
           <w:sz w:val="24"/>
         </w:rPr>
-        <w:t>Our group of five students will work with Dr. Susan Dudley, a professor in the Department of Biology and the lead Community Project Champion, and Wayne Terryberry, Coordinator of Natural Lands and Outdoor Recreation. Nature @ McMaster and Facility Services will prepare the plots, and we will update both champions every week. Friends and classmates we invite will help on planting day. Students, staff, and visitors who walk past the site will see the plot as it grows, and native bees and other pollinators could gain a new source of food. Faculty of Science students who may continue monitoring the plot from spring 2027 will also rely on the records we leave behind.</w:t>
+        <w:t>Our group of five students will work with Dr. Susan Dudley, a professor in the Department of Biology and our Community Project Champion. Nature @ McMaster and Facility Services will prepare the plots, and we will update Dr. Dudley every week. Friends and classmates we invite will help on planting day. Students, staff, and visitors who walk past the site will see the plot as it grows, and native bees and other pollinators could gain a new source of food. Faculty of Science students who may continue monitoring the plot from spring 2027 will also rely on the records we leave behind.</w:t>
       </w:r>
     </w:p>
     <w:p>
@@ -248,7 +225,7 @@
           <w:i w:val="0"/>
           <w:sz w:val="24"/>
         </w:rPr>
-        <w:t>We can help by reviewing the research, choosing species with a clear scoring framework, seeding a replicated demonstration plot in November, and recording a baseline that spring monitoring can be compared against. That work will help campus staff decide whether native groundcover is a realistic alternative to turf in places where mowing is costly. This is why we are pursuing this project throughout the term.</w:t>
+        <w:t>We can help by reviewing the research, choosing species with a clear scoring framework, assessing three campus green spaces, seeding a replicated demonstration plot in November, and recording a baseline that spring monitoring can be compared against. That work will help campus staff decide whether native groundcover is a realistic alternative to turf in places where mowing is costly. This is why we are pursuing this project throughout the term.</w:t>
       </w:r>
     </w:p>
     <w:p>
@@ -282,7 +259,7 @@
           <w:i w:val="0"/>
           <w:sz w:val="24"/>
         </w:rPr>
-        <w:t>We have three objectives, and each one builds on the last. The first finds the species, the second puts them in the ground on campus, and the third turns what we learn into guidance McMaster can use.</w:t>
+        <w:t>We have three objectives, and each one builds on the last. The first finds the species, the second tests where on campus they could work, and the third turns what we learn into guidance McMaster can use.</w:t>
       </w:r>
     </w:p>
     <w:tbl>
@@ -418,7 +395,7 @@
                 <w:i w:val="0"/>
                 <w:sz w:val="24"/>
               </w:rPr>
-              <w:t>Identify six native groundcover species suited to McMaster's clay, sun, and traffic by October 30.</w:t>
+              <w:t>Identify six suitable native groundcover species through research by October 30, 2026.</w:t>
             </w:r>
           </w:p>
         </w:tc>
@@ -476,7 +453,7 @@
                 <w:i w:val="0"/>
                 <w:sz w:val="24"/>
               </w:rPr>
-              <w:t>Establish a replicated plot to compare three native mixes with turf by November 28.</w:t>
+              <w:t>Assess three McMaster campus green spaces for potential native groundcover suitability by November 28, 2026.</w:t>
             </w:r>
           </w:p>
         </w:tc>
@@ -532,7 +509,7 @@
                 <w:i w:val="0"/>
                 <w:sz w:val="24"/>
               </w:rPr>
-              <w:t>Recommend monitoring and expansion priorities to both CPCs in a final report by December 4.</w:t>
+              <w:t>Recommend three groundcover species and future monitoring strategies in a report by December 4, 2026.</w:t>
             </w:r>
           </w:p>
         </w:tc>
@@ -574,74 +551,677 @@
         <w:t>Each objective was checked against the SMART criteria in the course rubric, which ask for goals that are specific, measurable, achievable, relevant, and time bound. The idea comes from an earlier management checklist that asked for goals that are specific, measurable, assignable, realistic, and time related (Doran, 1981).</w:t>
       </w:r>
     </w:p>
+    <w:tbl>
+      <w:tblPr>
+        <w:jc w:val="center"/>
+        <w:tblLayout w:type="fixed"/>
+        <w:tblLook w:firstColumn="1" w:firstRow="1" w:lastColumn="0" w:lastRow="0" w:noHBand="0" w:noVBand="1" w:val="04A0"/>
+        <w:tblBorders>
+          <w:top w:val="single" w:sz="4" w:space="0" w:color="BFBFBF"/>
+          <w:left w:val="single" w:sz="4" w:space="0" w:color="BFBFBF"/>
+          <w:bottom w:val="single" w:sz="4" w:space="0" w:color="BFBFBF"/>
+          <w:right w:val="single" w:sz="4" w:space="0" w:color="BFBFBF"/>
+          <w:insideH w:val="single" w:sz="4" w:space="0" w:color="BFBFBF"/>
+          <w:insideV w:val="single" w:sz="4" w:space="0" w:color="BFBFBF"/>
+        </w:tblBorders>
+        <w:tblLayout w:type="fixed"/>
+        <w:tblW w:w="9360" w:type="dxa"/>
+      </w:tblPr>
+      <w:tblGrid>
+        <w:gridCol w:w="1440"/>
+        <w:gridCol w:w="2664"/>
+        <w:gridCol w:w="2664"/>
+        <w:gridCol w:w="2592"/>
+      </w:tblGrid>
+      <w:tr>
+        <w:trPr>
+          <w:tblHeader w:val="true"/>
+          <w:cantSplit w:val="true"/>
+        </w:trPr>
+        <w:tc>
+          <w:tcPr>
+            <w:tcW w:type="dxa" w:w="1440"/>
+            <w:shd w:val="clear" w:color="auto" w:fill="1F5C35"/>
+            <w:tcMar>
+              <w:top w:w="60" w:type="dxa"/>
+              <w:left w:w="90" w:type="dxa"/>
+              <w:bottom w:w="60" w:type="dxa"/>
+              <w:right w:w="90" w:type="dxa"/>
+            </w:tcMar>
+            <w:vAlign w:val="center"/>
+          </w:tcPr>
+          <w:p>
+            <w:pPr>
+              <w:spacing w:after="0"/>
+            </w:pPr>
+          </w:p>
+        </w:tc>
+        <w:tc>
+          <w:tcPr>
+            <w:tcW w:type="dxa" w:w="2664"/>
+            <w:shd w:val="clear" w:color="auto" w:fill="1F5C35"/>
+            <w:tcMar>
+              <w:top w:w="60" w:type="dxa"/>
+              <w:left w:w="90" w:type="dxa"/>
+              <w:bottom w:w="60" w:type="dxa"/>
+              <w:right w:w="90" w:type="dxa"/>
+            </w:tcMar>
+            <w:vAlign w:val="center"/>
+          </w:tcPr>
+          <w:p>
+            <w:pPr>
+              <w:spacing w:after="0"/>
+            </w:pPr>
+            <w:r>
+              <w:rPr>
+                <w:rFonts w:ascii="Times New Roman" w:hAnsi="Times New Roman" w:eastAsia="Times New Roman"/>
+                <w:b/>
+                <w:i w:val="0"/>
+                <w:color w:val="FFFFFF"/>
+                <w:sz w:val="24"/>
+              </w:rPr>
+              <w:t>Objective 1</w:t>
+            </w:r>
+          </w:p>
+        </w:tc>
+        <w:tc>
+          <w:tcPr>
+            <w:tcW w:type="dxa" w:w="2664"/>
+            <w:shd w:val="clear" w:color="auto" w:fill="1F5C35"/>
+            <w:tcMar>
+              <w:top w:w="60" w:type="dxa"/>
+              <w:left w:w="90" w:type="dxa"/>
+              <w:bottom w:w="60" w:type="dxa"/>
+              <w:right w:w="90" w:type="dxa"/>
+            </w:tcMar>
+            <w:vAlign w:val="center"/>
+          </w:tcPr>
+          <w:p>
+            <w:pPr>
+              <w:spacing w:after="0"/>
+            </w:pPr>
+            <w:r>
+              <w:rPr>
+                <w:rFonts w:ascii="Times New Roman" w:hAnsi="Times New Roman" w:eastAsia="Times New Roman"/>
+                <w:b/>
+                <w:i w:val="0"/>
+                <w:color w:val="FFFFFF"/>
+                <w:sz w:val="24"/>
+              </w:rPr>
+              <w:t>Objective 2</w:t>
+            </w:r>
+          </w:p>
+        </w:tc>
+        <w:tc>
+          <w:tcPr>
+            <w:tcW w:type="dxa" w:w="2592"/>
+            <w:shd w:val="clear" w:color="auto" w:fill="1F5C35"/>
+            <w:tcMar>
+              <w:top w:w="60" w:type="dxa"/>
+              <w:left w:w="90" w:type="dxa"/>
+              <w:bottom w:w="60" w:type="dxa"/>
+              <w:right w:w="90" w:type="dxa"/>
+            </w:tcMar>
+            <w:vAlign w:val="center"/>
+          </w:tcPr>
+          <w:p>
+            <w:pPr>
+              <w:spacing w:after="0"/>
+            </w:pPr>
+            <w:r>
+              <w:rPr>
+                <w:rFonts w:ascii="Times New Roman" w:hAnsi="Times New Roman" w:eastAsia="Times New Roman"/>
+                <w:b/>
+                <w:i w:val="0"/>
+                <w:color w:val="FFFFFF"/>
+                <w:sz w:val="24"/>
+              </w:rPr>
+              <w:t>Objective 3</w:t>
+            </w:r>
+          </w:p>
+        </w:tc>
+      </w:tr>
+      <w:tr>
+        <w:trPr>
+          <w:cantSplit w:val="true"/>
+        </w:trPr>
+        <w:tc>
+          <w:tcPr>
+            <w:tcW w:type="dxa" w:w="1440"/>
+            <w:tcMar>
+              <w:top w:w="60" w:type="dxa"/>
+              <w:left w:w="90" w:type="dxa"/>
+              <w:bottom w:w="60" w:type="dxa"/>
+              <w:right w:w="90" w:type="dxa"/>
+            </w:tcMar>
+            <w:shd w:val="clear" w:color="auto" w:fill="E6F0E9"/>
+          </w:tcPr>
+          <w:p>
+            <w:pPr>
+              <w:spacing w:after="40" w:line="252" w:lineRule="auto"/>
+            </w:pPr>
+            <w:r>
+              <w:rPr>
+                <w:rFonts w:ascii="Times New Roman" w:hAnsi="Times New Roman" w:eastAsia="Times New Roman"/>
+                <w:b/>
+                <w:i w:val="0"/>
+                <w:sz w:val="24"/>
+              </w:rPr>
+              <w:t>Specific</w:t>
+            </w:r>
+          </w:p>
+        </w:tc>
+        <w:tc>
+          <w:tcPr>
+            <w:tcW w:type="dxa" w:w="2664"/>
+            <w:tcMar>
+              <w:top w:w="60" w:type="dxa"/>
+              <w:left w:w="90" w:type="dxa"/>
+              <w:bottom w:w="60" w:type="dxa"/>
+              <w:right w:w="90" w:type="dxa"/>
+            </w:tcMar>
+          </w:tcPr>
+          <w:p>
+            <w:pPr>
+              <w:spacing w:after="40" w:line="252" w:lineRule="auto"/>
+            </w:pPr>
+            <w:r>
+              <w:rPr>
+                <w:rFonts w:ascii="Times New Roman" w:hAnsi="Times New Roman" w:eastAsia="Times New Roman"/>
+                <w:b w:val="0"/>
+                <w:i w:val="0"/>
+                <w:sz w:val="24"/>
+              </w:rPr>
+              <w:t>Six species native to Ontario that tolerate clay soil, full sun, and moderate foot traffic, need little or no mowing, and support pollinators.</w:t>
+            </w:r>
+          </w:p>
+        </w:tc>
+        <w:tc>
+          <w:tcPr>
+            <w:tcW w:type="dxa" w:w="2664"/>
+            <w:tcMar>
+              <w:top w:w="60" w:type="dxa"/>
+              <w:left w:w="90" w:type="dxa"/>
+              <w:bottom w:w="60" w:type="dxa"/>
+              <w:right w:w="90" w:type="dxa"/>
+            </w:tcMar>
+          </w:tcPr>
+          <w:p>
+            <w:pPr>
+              <w:spacing w:after="40" w:line="252" w:lineRule="auto"/>
+            </w:pPr>
+            <w:r>
+              <w:rPr>
+                <w:rFonts w:ascii="Times New Roman" w:hAnsi="Times New Roman" w:eastAsia="Times New Roman"/>
+                <w:b w:val="0"/>
+                <w:i w:val="0"/>
+                <w:sz w:val="24"/>
+              </w:rPr>
+              <w:t>Three campus green spaces, including the helipad demonstration plot, assessed for sun, soil, drainage, slope, foot traffic, and current mowing.</w:t>
+            </w:r>
+          </w:p>
+        </w:tc>
+        <w:tc>
+          <w:tcPr>
+            <w:tcW w:type="dxa" w:w="2592"/>
+            <w:tcMar>
+              <w:top w:w="60" w:type="dxa"/>
+              <w:left w:w="90" w:type="dxa"/>
+              <w:bottom w:w="60" w:type="dxa"/>
+              <w:right w:w="90" w:type="dxa"/>
+            </w:tcMar>
+          </w:tcPr>
+          <w:p>
+            <w:pPr>
+              <w:spacing w:after="40" w:line="252" w:lineRule="auto"/>
+            </w:pPr>
+            <w:r>
+              <w:rPr>
+                <w:rFonts w:ascii="Times New Roman" w:hAnsi="Times New Roman" w:eastAsia="Times New Roman"/>
+                <w:b w:val="0"/>
+                <w:i w:val="0"/>
+                <w:sz w:val="24"/>
+              </w:rPr>
+              <w:t>Three of the six species ranked for McMaster, plus a plan for monitoring germination, percent cover, weeds, mowing needs, and pollinator visits.</w:t>
+            </w:r>
+          </w:p>
+        </w:tc>
+      </w:tr>
+      <w:tr>
+        <w:trPr>
+          <w:cantSplit w:val="true"/>
+        </w:trPr>
+        <w:tc>
+          <w:tcPr>
+            <w:tcW w:type="dxa" w:w="1440"/>
+            <w:tcMar>
+              <w:top w:w="60" w:type="dxa"/>
+              <w:left w:w="90" w:type="dxa"/>
+              <w:bottom w:w="60" w:type="dxa"/>
+              <w:right w:w="90" w:type="dxa"/>
+            </w:tcMar>
+            <w:shd w:val="clear" w:color="auto" w:fill="E6F0E9"/>
+          </w:tcPr>
+          <w:p>
+            <w:pPr>
+              <w:spacing w:after="40" w:line="252" w:lineRule="auto"/>
+            </w:pPr>
+            <w:r>
+              <w:rPr>
+                <w:rFonts w:ascii="Times New Roman" w:hAnsi="Times New Roman" w:eastAsia="Times New Roman"/>
+                <w:b/>
+                <w:i w:val="0"/>
+                <w:sz w:val="24"/>
+              </w:rPr>
+              <w:t>Measurable</w:t>
+            </w:r>
+          </w:p>
+        </w:tc>
+        <w:tc>
+          <w:tcPr>
+            <w:tcW w:type="dxa" w:w="2664"/>
+            <w:tcMar>
+              <w:top w:w="60" w:type="dxa"/>
+              <w:left w:w="90" w:type="dxa"/>
+              <w:bottom w:w="60" w:type="dxa"/>
+              <w:right w:w="90" w:type="dxa"/>
+            </w:tcMar>
+            <w:shd w:val="clear" w:color="auto" w:fill="F7F9F7"/>
+          </w:tcPr>
+          <w:p>
+            <w:pPr>
+              <w:spacing w:after="40" w:line="252" w:lineRule="auto"/>
+            </w:pPr>
+            <w:r>
+              <w:rPr>
+                <w:rFonts w:ascii="Times New Roman" w:hAnsi="Times New Roman" w:eastAsia="Times New Roman"/>
+                <w:b w:val="0"/>
+                <w:i w:val="0"/>
+                <w:sz w:val="24"/>
+              </w:rPr>
+              <w:t>Six species scored with the evaluation framework, each backed by at least two sources from a log of 15 or more.</w:t>
+            </w:r>
+          </w:p>
+        </w:tc>
+        <w:tc>
+          <w:tcPr>
+            <w:tcW w:type="dxa" w:w="2664"/>
+            <w:tcMar>
+              <w:top w:w="60" w:type="dxa"/>
+              <w:left w:w="90" w:type="dxa"/>
+              <w:bottom w:w="60" w:type="dxa"/>
+              <w:right w:w="90" w:type="dxa"/>
+            </w:tcMar>
+            <w:shd w:val="clear" w:color="auto" w:fill="F7F9F7"/>
+          </w:tcPr>
+          <w:p>
+            <w:pPr>
+              <w:spacing w:after="40" w:line="252" w:lineRule="auto"/>
+            </w:pPr>
+            <w:r>
+              <w:rPr>
+                <w:rFonts w:ascii="Times New Roman" w:hAnsi="Times New Roman" w:eastAsia="Times New Roman"/>
+                <w:b w:val="0"/>
+                <w:i w:val="0"/>
+                <w:sz w:val="24"/>
+              </w:rPr>
+              <w:t>One completed assessment sheet with dated photos for each space, each space rated against the six species, and the helipad plot seeded.</w:t>
+            </w:r>
+          </w:p>
+        </w:tc>
+        <w:tc>
+          <w:tcPr>
+            <w:tcW w:type="dxa" w:w="2592"/>
+            <w:tcMar>
+              <w:top w:w="60" w:type="dxa"/>
+              <w:left w:w="90" w:type="dxa"/>
+              <w:bottom w:w="60" w:type="dxa"/>
+              <w:right w:w="90" w:type="dxa"/>
+            </w:tcMar>
+            <w:shd w:val="clear" w:color="auto" w:fill="F7F9F7"/>
+          </w:tcPr>
+          <w:p>
+            <w:pPr>
+              <w:spacing w:after="40" w:line="252" w:lineRule="auto"/>
+            </w:pPr>
+            <w:r>
+              <w:rPr>
+                <w:rFonts w:ascii="Times New Roman" w:hAnsi="Times New Roman" w:eastAsia="Times New Roman"/>
+                <w:b w:val="0"/>
+                <w:i w:val="0"/>
+                <w:sz w:val="24"/>
+              </w:rPr>
+              <w:t>One final report with three ranked species and reasons, a monitoring protocol, and a blank data sheet.</w:t>
+            </w:r>
+          </w:p>
+        </w:tc>
+      </w:tr>
+      <w:tr>
+        <w:trPr>
+          <w:cantSplit w:val="true"/>
+        </w:trPr>
+        <w:tc>
+          <w:tcPr>
+            <w:tcW w:type="dxa" w:w="1440"/>
+            <w:tcMar>
+              <w:top w:w="60" w:type="dxa"/>
+              <w:left w:w="90" w:type="dxa"/>
+              <w:bottom w:w="60" w:type="dxa"/>
+              <w:right w:w="90" w:type="dxa"/>
+            </w:tcMar>
+            <w:shd w:val="clear" w:color="auto" w:fill="E6F0E9"/>
+          </w:tcPr>
+          <w:p>
+            <w:pPr>
+              <w:spacing w:after="40" w:line="252" w:lineRule="auto"/>
+            </w:pPr>
+            <w:r>
+              <w:rPr>
+                <w:rFonts w:ascii="Times New Roman" w:hAnsi="Times New Roman" w:eastAsia="Times New Roman"/>
+                <w:b/>
+                <w:i w:val="0"/>
+                <w:sz w:val="24"/>
+              </w:rPr>
+              <w:t>Achievable</w:t>
+            </w:r>
+          </w:p>
+        </w:tc>
+        <w:tc>
+          <w:tcPr>
+            <w:tcW w:type="dxa" w:w="2664"/>
+            <w:tcMar>
+              <w:top w:w="60" w:type="dxa"/>
+              <w:left w:w="90" w:type="dxa"/>
+              <w:bottom w:w="60" w:type="dxa"/>
+              <w:right w:w="90" w:type="dxa"/>
+            </w:tcMar>
+          </w:tcPr>
+          <w:p>
+            <w:pPr>
+              <w:spacing w:after="40" w:line="252" w:lineRule="auto"/>
+            </w:pPr>
+            <w:r>
+              <w:rPr>
+                <w:rFonts w:ascii="Times New Roman" w:hAnsi="Times New Roman" w:eastAsia="Times New Roman"/>
+                <w:b w:val="0"/>
+                <w:i w:val="0"/>
+                <w:sz w:val="24"/>
+              </w:rPr>
+              <w:t>Five members each log at least three sources over three weeks, at about four hours a week.</w:t>
+            </w:r>
+          </w:p>
+        </w:tc>
+        <w:tc>
+          <w:tcPr>
+            <w:tcW w:type="dxa" w:w="2664"/>
+            <w:tcMar>
+              <w:top w:w="60" w:type="dxa"/>
+              <w:left w:w="90" w:type="dxa"/>
+              <w:bottom w:w="60" w:type="dxa"/>
+              <w:right w:w="90" w:type="dxa"/>
+            </w:tcMar>
+          </w:tcPr>
+          <w:p>
+            <w:pPr>
+              <w:spacing w:after="40" w:line="252" w:lineRule="auto"/>
+            </w:pPr>
+            <w:r>
+              <w:rPr>
+                <w:rFonts w:ascii="Times New Roman" w:hAnsi="Times New Roman" w:eastAsia="Times New Roman"/>
+                <w:b w:val="0"/>
+                <w:i w:val="0"/>
+                <w:sz w:val="24"/>
+              </w:rPr>
+              <w:t>Dr. Dudley helps choose the spaces, Nature @ McMaster prepares the helipad plot, and visits fit into weeks 5 to 9.</w:t>
+            </w:r>
+          </w:p>
+        </w:tc>
+        <w:tc>
+          <w:tcPr>
+            <w:tcW w:type="dxa" w:w="2592"/>
+            <w:tcMar>
+              <w:top w:w="60" w:type="dxa"/>
+              <w:left w:w="90" w:type="dxa"/>
+              <w:bottom w:w="60" w:type="dxa"/>
+              <w:right w:w="90" w:type="dxa"/>
+            </w:tcMar>
+          </w:tcPr>
+          <w:p>
+            <w:pPr>
+              <w:spacing w:after="40" w:line="252" w:lineRule="auto"/>
+            </w:pPr>
+            <w:r>
+              <w:rPr>
+                <w:rFonts w:ascii="Times New Roman" w:hAnsi="Times New Roman" w:eastAsia="Times New Roman"/>
+                <w:b w:val="0"/>
+                <w:i w:val="0"/>
+                <w:sz w:val="24"/>
+              </w:rPr>
+              <w:t>Writing starts in week 10, and Dr. Dudley sees a draft on December 1.</w:t>
+            </w:r>
+          </w:p>
+        </w:tc>
+      </w:tr>
+      <w:tr>
+        <w:trPr>
+          <w:cantSplit w:val="true"/>
+        </w:trPr>
+        <w:tc>
+          <w:tcPr>
+            <w:tcW w:type="dxa" w:w="1440"/>
+            <w:tcMar>
+              <w:top w:w="60" w:type="dxa"/>
+              <w:left w:w="90" w:type="dxa"/>
+              <w:bottom w:w="60" w:type="dxa"/>
+              <w:right w:w="90" w:type="dxa"/>
+            </w:tcMar>
+            <w:shd w:val="clear" w:color="auto" w:fill="E6F0E9"/>
+          </w:tcPr>
+          <w:p>
+            <w:pPr>
+              <w:spacing w:after="40" w:line="252" w:lineRule="auto"/>
+            </w:pPr>
+            <w:r>
+              <w:rPr>
+                <w:rFonts w:ascii="Times New Roman" w:hAnsi="Times New Roman" w:eastAsia="Times New Roman"/>
+                <w:b/>
+                <w:i w:val="0"/>
+                <w:sz w:val="24"/>
+              </w:rPr>
+              <w:t>Relevant</w:t>
+            </w:r>
+          </w:p>
+        </w:tc>
+        <w:tc>
+          <w:tcPr>
+            <w:tcW w:type="dxa" w:w="2664"/>
+            <w:tcMar>
+              <w:top w:w="60" w:type="dxa"/>
+              <w:left w:w="90" w:type="dxa"/>
+              <w:bottom w:w="60" w:type="dxa"/>
+              <w:right w:w="90" w:type="dxa"/>
+            </w:tcMar>
+            <w:shd w:val="clear" w:color="auto" w:fill="F7F9F7"/>
+          </w:tcPr>
+          <w:p>
+            <w:pPr>
+              <w:spacing w:after="40" w:line="252" w:lineRule="auto"/>
+            </w:pPr>
+            <w:r>
+              <w:rPr>
+                <w:rFonts w:ascii="Times New Roman" w:hAnsi="Times New Roman" w:eastAsia="Times New Roman"/>
+                <w:b w:val="0"/>
+                <w:i w:val="0"/>
+                <w:sz w:val="24"/>
+              </w:rPr>
+              <w:t>The criteria come straight from the project description, and the list feeds both the site assessments and the final recommendations.</w:t>
+            </w:r>
+          </w:p>
+        </w:tc>
+        <w:tc>
+          <w:tcPr>
+            <w:tcW w:type="dxa" w:w="2664"/>
+            <w:tcMar>
+              <w:top w:w="60" w:type="dxa"/>
+              <w:left w:w="90" w:type="dxa"/>
+              <w:bottom w:w="60" w:type="dxa"/>
+              <w:right w:w="90" w:type="dxa"/>
+            </w:tcMar>
+            <w:shd w:val="clear" w:color="auto" w:fill="F7F9F7"/>
+          </w:tcPr>
+          <w:p>
+            <w:pPr>
+              <w:spacing w:after="40" w:line="252" w:lineRule="auto"/>
+            </w:pPr>
+            <w:r>
+              <w:rPr>
+                <w:rFonts w:ascii="Times New Roman" w:hAnsi="Times New Roman" w:eastAsia="Times New Roman"/>
+                <w:b w:val="0"/>
+                <w:i w:val="0"/>
+                <w:sz w:val="24"/>
+              </w:rPr>
+              <w:t>It shows where native groundcover could realistically replace turf on campus, not just in theory.</w:t>
+            </w:r>
+          </w:p>
+        </w:tc>
+        <w:tc>
+          <w:tcPr>
+            <w:tcW w:type="dxa" w:w="2592"/>
+            <w:tcMar>
+              <w:top w:w="60" w:type="dxa"/>
+              <w:left w:w="90" w:type="dxa"/>
+              <w:bottom w:w="60" w:type="dxa"/>
+              <w:right w:w="90" w:type="dxa"/>
+            </w:tcMar>
+            <w:shd w:val="clear" w:color="auto" w:fill="F7F9F7"/>
+          </w:tcPr>
+          <w:p>
+            <w:pPr>
+              <w:spacing w:after="40" w:line="252" w:lineRule="auto"/>
+            </w:pPr>
+            <w:r>
+              <w:rPr>
+                <w:rFonts w:ascii="Times New Roman" w:hAnsi="Times New Roman" w:eastAsia="Times New Roman"/>
+                <w:b w:val="0"/>
+                <w:i w:val="0"/>
+                <w:sz w:val="24"/>
+              </w:rPr>
+              <w:t>It gives McMaster a clear next step and lets future students continue monitoring the helipad plot.</w:t>
+            </w:r>
+          </w:p>
+        </w:tc>
+      </w:tr>
+      <w:tr>
+        <w:trPr>
+          <w:cantSplit w:val="true"/>
+        </w:trPr>
+        <w:tc>
+          <w:tcPr>
+            <w:tcW w:type="dxa" w:w="1440"/>
+            <w:tcMar>
+              <w:top w:w="60" w:type="dxa"/>
+              <w:left w:w="90" w:type="dxa"/>
+              <w:bottom w:w="60" w:type="dxa"/>
+              <w:right w:w="90" w:type="dxa"/>
+            </w:tcMar>
+            <w:shd w:val="clear" w:color="auto" w:fill="E6F0E9"/>
+          </w:tcPr>
+          <w:p>
+            <w:pPr>
+              <w:spacing w:after="40" w:line="252" w:lineRule="auto"/>
+            </w:pPr>
+            <w:r>
+              <w:rPr>
+                <w:rFonts w:ascii="Times New Roman" w:hAnsi="Times New Roman" w:eastAsia="Times New Roman"/>
+                <w:b/>
+                <w:i w:val="0"/>
+                <w:sz w:val="24"/>
+              </w:rPr>
+              <w:t>Time bound</w:t>
+            </w:r>
+          </w:p>
+        </w:tc>
+        <w:tc>
+          <w:tcPr>
+            <w:tcW w:type="dxa" w:w="2664"/>
+            <w:tcMar>
+              <w:top w:w="60" w:type="dxa"/>
+              <w:left w:w="90" w:type="dxa"/>
+              <w:bottom w:w="60" w:type="dxa"/>
+              <w:right w:w="90" w:type="dxa"/>
+            </w:tcMar>
+          </w:tcPr>
+          <w:p>
+            <w:pPr>
+              <w:spacing w:after="40" w:line="252" w:lineRule="auto"/>
+            </w:pPr>
+            <w:r>
+              <w:rPr>
+                <w:rFonts w:ascii="Times New Roman" w:hAnsi="Times New Roman" w:eastAsia="Times New Roman"/>
+                <w:b w:val="0"/>
+                <w:i w:val="0"/>
+                <w:sz w:val="24"/>
+              </w:rPr>
+              <w:t>Shortlist approved by Dr. Dudley by Friday, October 30, 2026.</w:t>
+            </w:r>
+          </w:p>
+        </w:tc>
+        <w:tc>
+          <w:tcPr>
+            <w:tcW w:type="dxa" w:w="2664"/>
+            <w:tcMar>
+              <w:top w:w="60" w:type="dxa"/>
+              <w:left w:w="90" w:type="dxa"/>
+              <w:bottom w:w="60" w:type="dxa"/>
+              <w:right w:w="90" w:type="dxa"/>
+            </w:tcMar>
+          </w:tcPr>
+          <w:p>
+            <w:pPr>
+              <w:spacing w:after="40" w:line="252" w:lineRule="auto"/>
+            </w:pPr>
+            <w:r>
+              <w:rPr>
+                <w:rFonts w:ascii="Times New Roman" w:hAnsi="Times New Roman" w:eastAsia="Times New Roman"/>
+                <w:b w:val="0"/>
+                <w:i w:val="0"/>
+                <w:sz w:val="24"/>
+              </w:rPr>
+              <w:t>All three assessments done and the helipad plot seeded by Saturday, November 28, 2026.</w:t>
+            </w:r>
+          </w:p>
+        </w:tc>
+        <w:tc>
+          <w:tcPr>
+            <w:tcW w:type="dxa" w:w="2592"/>
+            <w:tcMar>
+              <w:top w:w="60" w:type="dxa"/>
+              <w:left w:w="90" w:type="dxa"/>
+              <w:bottom w:w="60" w:type="dxa"/>
+              <w:right w:w="90" w:type="dxa"/>
+            </w:tcMar>
+          </w:tcPr>
+          <w:p>
+            <w:pPr>
+              <w:spacing w:after="40" w:line="252" w:lineRule="auto"/>
+            </w:pPr>
+            <w:r>
+              <w:rPr>
+                <w:rFonts w:ascii="Times New Roman" w:hAnsi="Times New Roman" w:eastAsia="Times New Roman"/>
+                <w:b w:val="0"/>
+                <w:i w:val="0"/>
+                <w:sz w:val="24"/>
+              </w:rPr>
+              <w:t>Report delivered to Dr. Dudley by Friday, December 4, 2026.</w:t>
+            </w:r>
+          </w:p>
+        </w:tc>
+      </w:tr>
+    </w:tbl>
     <w:p>
       <w:pPr>
-        <w:spacing w:after="120" w:before="0" w:line="276" w:lineRule="auto"/>
+        <w:spacing w:after="80" w:line="144" w:lineRule="auto"/>
       </w:pPr>
-      <w:r>
-        <w:rPr>
-          <w:rFonts w:ascii="Times New Roman" w:hAnsi="Times New Roman" w:eastAsia="Times New Roman"/>
-          <w:b/>
-          <w:i w:val="0"/>
-          <w:sz w:val="24"/>
-        </w:rPr>
-        <w:t>Objective 1</w:t>
-      </w:r>
-      <w:r>
-        <w:rPr>
-          <w:rFonts w:ascii="Times New Roman" w:hAnsi="Times New Roman" w:eastAsia="Times New Roman"/>
-          <w:b w:val="0"/>
-          <w:i w:val="0"/>
-          <w:sz w:val="24"/>
-        </w:rPr>
-        <w:t xml:space="preserve"> is specific because it names the six species we need and the conditions they must handle, which are the clay, full sun, and foot traffic at the helipad site. Progress is easy to measure, since the shortlist has six names and the source log behind it has to reach at least 15 sources. Splitting the reading so each of the five of us logs at least three sources over three weeks makes it achievable. The objective is relevant because the species we pick decide whether the plot can answer the turf question at all, and it is time bound by Friday, October 30, in week 6.</w:t>
-      </w:r>
-    </w:p>
-    <w:p>
-      <w:pPr>
-        <w:spacing w:after="120" w:before="0" w:line="276" w:lineRule="auto"/>
-      </w:pPr>
-      <w:r>
-        <w:rPr>
-          <w:rFonts w:ascii="Times New Roman" w:hAnsi="Times New Roman" w:eastAsia="Times New Roman"/>
-          <w:b/>
-          <w:i w:val="0"/>
-          <w:sz w:val="24"/>
-        </w:rPr>
-        <w:t>Objective 2</w:t>
-      </w:r>
-      <w:r>
-        <w:rPr>
-          <w:rFonts w:ascii="Times New Roman" w:hAnsi="Times New Roman" w:eastAsia="Times New Roman"/>
-          <w:b w:val="0"/>
-          <w:i w:val="0"/>
-          <w:sz w:val="24"/>
-        </w:rPr>
-        <w:t xml:space="preserve"> is specific about both the action and the place, since it is a replicated plot near the helipad that compares three native mixes with a turf grass control. We will know it is done when all nine native subplots are seeded and mulched and the three turf subplots are marked, which makes twelve subplots in three blocks. It is achievable because Nature @ McMaster prepares the ground and the CPCs supply the straw, which leaves us the seeding and raking. A real planting is relevant because it gives McMaster evidence from its own soil and not only from the literature. We plan to plant on Saturday, November 21 and must finish by November 28.</w:t>
-      </w:r>
-    </w:p>
-    <w:p>
-      <w:pPr>
-        <w:spacing w:after="120" w:before="0" w:line="276" w:lineRule="auto"/>
-      </w:pPr>
-      <w:r>
-        <w:rPr>
-          <w:rFonts w:ascii="Times New Roman" w:hAnsi="Times New Roman" w:eastAsia="Times New Roman"/>
-          <w:b/>
-          <w:i w:val="0"/>
-          <w:sz w:val="24"/>
-        </w:rPr>
-        <w:t>Objective 3</w:t>
-      </w:r>
-      <w:r>
-        <w:rPr>
-          <w:rFonts w:ascii="Times New Roman" w:hAnsi="Times New Roman" w:eastAsia="Times New Roman"/>
-          <w:b w:val="0"/>
-          <w:i w:val="0"/>
-          <w:sz w:val="24"/>
-        </w:rPr>
-        <w:t xml:space="preserve"> names exactly who receives the work, which is both CPCs, and what they receive, which is a ranked set of priorities for monitoring and expansion. It is measurable because the final report must include a monitoring protocol, a blank data sheet, and clear criteria for expanding a species. Writing starts in week 10 and the CPCs see a draft on December 1, which makes the timing achievable. It is relevant because campus staff need to know what to measure next spring before they can decide anything, and it is due December 4, one day before the course submission.</w:t>
-      </w:r>
     </w:p>
     <w:p>
       <w:pPr>
@@ -1184,7 +1764,7 @@
                 <w:i w:val="0"/>
                 <w:sz w:val="24"/>
               </w:rPr>
-              <w:t>Design and planting plan.</w:t>
+              <w:t>Site assessments and planting plan.</w:t>
             </w:r>
             <w:r>
               <w:rPr>
@@ -1193,7 +1773,7 @@
                 <w:i w:val="0"/>
                 <w:sz w:val="24"/>
               </w:rPr>
-              <w:t xml:space="preserve"> A labelled plot map with twelve subplots in three blocks, the random order of treatments in each block, the species and seeding rate for each mix, the amount of straw, the site preparation agreed with Nature @ McMaster, a supply list, a schedule for planting day, and the weather, cold, and helipad safety rules.</w:t>
+              <w:t xml:space="preserve"> An assessment sheet with dated photos for each of the three green spaces, covering sun, soil, drainage, slope, foot traffic, and current mowing, with each space rated against the six species. For the helipad plot it adds a labelled plot map with twelve subplots in three blocks, the random order of treatments in each block, the species and seeding rate for each mix, the amount of straw, the site preparation agreed with Nature @ McMaster, a supply list, a schedule for planting day, and the weather, cold, and helipad safety rules.</w:t>
             </w:r>
           </w:p>
         </w:tc>
@@ -1758,7 +2338,7 @@
                 <w:i w:val="0"/>
                 <w:sz w:val="24"/>
               </w:rPr>
-              <w:t>Monitoring and expansion recommendations.</w:t>
+              <w:t>Species recommendations and monitoring strategy.</w:t>
             </w:r>
             <w:r>
               <w:rPr>
@@ -1767,7 +2347,7 @@
                 <w:i w:val="0"/>
                 <w:sz w:val="24"/>
               </w:rPr>
-              <w:t xml:space="preserve"> A protocol for spring and summer 2027 and later years that covers germination counts, percent cover, weed cover, mowing needs, and pollinator visits, with a blank data sheet and clear criteria for deciding which species to expand.</w:t>
+              <w:t xml:space="preserve"> Three recommended species ranked with reasons, and a protocol for spring and summer 2027 and later years that covers germination counts, percent cover, weed cover, mowing needs, and pollinator visits, with a blank data sheet.</w:t>
             </w:r>
           </w:p>
         </w:tc>
@@ -1910,7 +2490,7 @@
                 <w:i w:val="0"/>
                 <w:sz w:val="24"/>
               </w:rPr>
-              <w:t xml:space="preserve"> One report that joins D1 to D7, explains its limits, and is delivered to both CPCs on December 4 with all files placed in a folder that Dr. Dudley owns, then submitted on Avenue on December 5.</w:t>
+              <w:t xml:space="preserve"> One report that joins D1 to D7, explains its limits, and is delivered to Dr. Dudley on December 4 with all files placed in a folder that Dr. Dudley owns, then submitted on Avenue on December 5.</w:t>
             </w:r>
           </w:p>
         </w:tc>
@@ -2202,7 +2782,7 @@
           <w:i w:val="0"/>
           <w:sz w:val="24"/>
         </w:rPr>
-        <w:t>Dr. Dudley is still discussing the site with grounds staff, so we will confirm the plot size, subplot size, and exact location with her, Wayne Terryberry, and Nature @ McMaster at a site visit in week 5 before we lock the design. At that visit we will also ask how the turf will be removed, on what date, and how deep, and we will photograph the site before that work starts so the baseline includes the original turf. Because the plot is near the McMaster helipad, we will ask how far it must sit from the landing area, whether loose straw is allowed there, and who we should notify before planting day.</w:t>
+        <w:t>Dr. Dudley is still discussing the site with grounds staff, so we will confirm the plot size, subplot size, and exact location with Nature @ McMaster and the grounds team at a site visit in week 5 before we lock the design, and we will choose the other two green spaces to assess with Dr. Dudley at the same time. At that visit we will also ask how the turf will be removed, on what date, and how deep, and we will photograph the site before that work starts so the baseline includes the original turf. Because the plot is near the McMaster helipad, we will ask how far it must sit from the landing area, whether loose straw is allowed there, and who we should notify before planting day.</w:t>
       </w:r>
     </w:p>
     <w:p>
@@ -2216,7 +2796,7 @@
           <w:i w:val="0"/>
           <w:sz w:val="24"/>
         </w:rPr>
-        <w:t>Nature @ McMaster and Facility Services will prepare the plots and the CPCs will supply the straw. We will weigh the seed for each subplot into a labelled bag, mix it with dry sand so it spreads evenly, broadcast it by hand, rake it lightly into the surface, and cover it with a thin layer of clean straw that is free of weed and grain seed. Seeding in the second half of November puts the seed on the ground as the growing season ends, so it can sit through winter and germinate in spring. In tallgrass prairie restoration trials, the authors recommended broadcasting seed in the dormant season over broadcasting in the growing season (Larson et al., 2011). Our late November date puts us in that dormant window.</w:t>
+        <w:t>Nature @ McMaster and Facility Services will prepare the plots and Dr. Dudley will supply the straw. We will weigh the seed for each subplot into a labelled bag, mix it with dry sand so it spreads evenly, broadcast it by hand, rake it lightly into the surface, and cover it with a thin layer of clean straw that is free of weed and grain seed. Seeding in the second half of November puts the seed on the ground as the growing season ends, so it can sit through winter and germinate in spring. In tallgrass prairie restoration trials, the authors recommended broadcasting seed in the dormant season over broadcasting in the growing season (Larson et al., 2011). Our late November date puts us in that dormant window.</w:t>
       </w:r>
     </w:p>
     <w:p>
@@ -2275,7 +2855,7 @@
           <w:i w:val="0"/>
           <w:sz w:val="24"/>
         </w:rPr>
-        <w:t>Knowing which species should work is not the same as seeing them grow on campus, so Objective 2 puts the shortlist into the ground beside a turf control. Mehrshid leads the plot design and the planting (D3 and D5) in weeks 7 to 10, Marchelino handles the seed (D4), and all five of us plant.</w:t>
+        <w:t>Knowing which species should work is not the same as seeing them grow on campus, so Objective 2 assesses three campus green spaces and puts the shortlist into the ground at the helipad plot beside a turf control. Mehrshid leads the site assessments, the plot design, and the planting (D3 and D5) in weeks 5 to 10, Marchelino handles the seed (D4), and all five of us plant.</w:t>
       </w:r>
     </w:p>
     <w:p>
@@ -2289,7 +2869,7 @@
           <w:i w:val="0"/>
           <w:sz w:val="24"/>
         </w:rPr>
-        <w:t>Even a well planted plot is only useful if someone knows what to measure next spring. Objective 3 covers that with the baseline record and the recommendations (D6 and D7), which Diya leads, the final report (D8), which Hadar compiles, and the presentation (D9), which Joseph coordinates, in weeks 10 and 11. Section 4 places each of these deliverables in a specific week.</w:t>
+        <w:t>Even a well planted plot is only useful if someone knows what to measure next spring. Objective 3 covers that with the baseline record and the three species recommendations and monitoring strategy (D6 and D7), which Diya leads, the final report (D8), which Hadar compiles, and the presentation (D9), which Joseph coordinates, in weeks 10 and 11. Section 4 places each of these deliverables in a specific week.</w:t>
       </w:r>
     </w:p>
     <w:p>
@@ -3185,7 +3765,7 @@
                 <w:i w:val="0"/>
                 <w:sz w:val="24"/>
               </w:rPr>
-              <w:t>Weekly email to the CPCs (graded)</w:t>
+              <w:t>Weekly email to Dr. Dudley (graded)</w:t>
             </w:r>
           </w:p>
         </w:tc>
@@ -4031,7 +4611,7 @@
                 <w:i w:val="0"/>
                 <w:sz w:val="24"/>
               </w:rPr>
-              <w:t>Site walk and site visit</w:t>
+              <w:t>Green space assessments (D3)</w:t>
             </w:r>
           </w:p>
         </w:tc>
@@ -4125,6 +4705,7 @@
               <w:bottom w:w="30" w:type="dxa"/>
               <w:right w:w="50" w:type="dxa"/>
             </w:tcMar>
+            <w:shd w:val="clear" w:color="auto" w:fill="1F5C35"/>
           </w:tcPr>
           <w:p>
             <w:pPr>
@@ -4141,6 +4722,7 @@
               <w:bottom w:w="30" w:type="dxa"/>
               <w:right w:w="50" w:type="dxa"/>
             </w:tcMar>
+            <w:shd w:val="clear" w:color="auto" w:fill="1F5C35"/>
           </w:tcPr>
           <w:p>
             <w:pPr>
@@ -4449,7 +5031,7 @@
                 <w:i w:val="0"/>
                 <w:sz w:val="24"/>
               </w:rPr>
-              <w:t>Design and planting plan (D3)</w:t>
+              <w:t>Plot design and planting plan (D3)</w:t>
             </w:r>
           </w:p>
         </w:tc>
@@ -5077,7 +5659,7 @@
                 <w:i w:val="0"/>
                 <w:sz w:val="24"/>
               </w:rPr>
-              <w:t>Monitoring and expansion recommendations (D7)</w:t>
+              <w:t>Species recommendations and monitoring (D7)</w:t>
             </w:r>
           </w:p>
         </w:tc>
@@ -6061,7 +6643,7 @@
                 <w:i w:val="0"/>
                 <w:sz w:val="24"/>
               </w:rPr>
-              <w:t>• Introductory weekly email to the CPCs.</w:t>
+              <w:t>• Introductory weekly email to Dr. Dudley.</w:t>
             </w:r>
           </w:p>
         </w:tc>
@@ -6269,7 +6851,7 @@
                 <w:i w:val="0"/>
                 <w:sz w:val="24"/>
               </w:rPr>
-              <w:t>• Weekly email asking the CPCs which species to prioritize.</w:t>
+              <w:t>• Weekly email asking which species to prioritize.</w:t>
             </w:r>
           </w:p>
         </w:tc>
@@ -6434,7 +7016,7 @@
                 <w:i w:val="0"/>
                 <w:sz w:val="24"/>
               </w:rPr>
-              <w:t>• Plan emailed to both CPCs with all members copied, and the screenshot added.</w:t>
+              <w:t>• Plan emailed to Dr. Dudley with all members copied, and the screenshot added.</w:t>
             </w:r>
           </w:p>
         </w:tc>
@@ -6877,7 +7459,7 @@
                 <w:i w:val="0"/>
                 <w:sz w:val="24"/>
               </w:rPr>
-              <w:t>• Site visit with Wayne Terryberry and Nature @ McMaster by Friday, October 23 to confirm location, plot size, preparation, and helipad rules.</w:t>
+              <w:t>• Site visit with Nature @ McMaster by Friday, October 23 to confirm the helipad plot size, preparation, and helipad rules, and the other two green spaces chosen with Dr. Dudley.</w:t>
             </w:r>
           </w:p>
           <w:p>
@@ -7114,7 +7696,7 @@
                 <w:i w:val="0"/>
                 <w:sz w:val="24"/>
               </w:rPr>
-              <w:t>• Seed quotes, stock, and delivery dates collected from at least two suppliers.</w:t>
+              <w:t>• Assessment sheets completed for the other two green spaces.</w:t>
             </w:r>
           </w:p>
           <w:p>
@@ -7129,7 +7711,22 @@
                 <w:i w:val="0"/>
                 <w:sz w:val="24"/>
               </w:rPr>
-              <w:t>• Volunteer waiver and McMaster approval question sent to the CPCs by Friday, October 30.</w:t>
+              <w:t>• Seed quotes, stock, and delivery dates collected from at least two suppliers.</w:t>
+            </w:r>
+          </w:p>
+          <w:p>
+            <w:pPr>
+              <w:spacing w:after="40" w:line="252" w:lineRule="auto"/>
+              <w:ind w:left="173" w:hanging="173"/>
+            </w:pPr>
+            <w:r>
+              <w:rPr>
+                <w:rFonts w:ascii="Times New Roman" w:hAnsi="Times New Roman" w:eastAsia="Times New Roman"/>
+                <w:b w:val="0"/>
+                <w:i w:val="0"/>
+                <w:sz w:val="24"/>
+              </w:rPr>
+              <w:t>• Volunteer waiver and McMaster approval question sent to Dr. Dudley by Friday, October 30.</w:t>
             </w:r>
           </w:p>
           <w:p>
@@ -7330,7 +7927,7 @@
                 <w:i w:val="0"/>
                 <w:sz w:val="24"/>
               </w:rPr>
-              <w:t>• Plot layout and the three mixes drafted from the confirmed plot size.</w:t>
+              <w:t>• All three green spaces rated against the six species.</w:t>
             </w:r>
           </w:p>
           <w:p>
@@ -7345,7 +7942,22 @@
                 <w:i w:val="0"/>
                 <w:sz w:val="24"/>
               </w:rPr>
-              <w:t>• Final seed cost checked against the budget the CPCs gave in week 4.</w:t>
+              <w:t>• Plot layout and the three mixes drafted from the confirmed plot size.</w:t>
+            </w:r>
+          </w:p>
+          <w:p>
+            <w:pPr>
+              <w:spacing w:after="40" w:line="252" w:lineRule="auto"/>
+              <w:ind w:left="173" w:hanging="173"/>
+            </w:pPr>
+            <w:r>
+              <w:rPr>
+                <w:rFonts w:ascii="Times New Roman" w:hAnsi="Times New Roman" w:eastAsia="Times New Roman"/>
+                <w:b w:val="0"/>
+                <w:i w:val="0"/>
+                <w:sz w:val="24"/>
+              </w:rPr>
+              <w:t>• Final seed cost checked against the budget Dr. Dudley gave in week 4.</w:t>
             </w:r>
           </w:p>
         </w:tc>
@@ -7427,6 +8039,20 @@
                 <w:sz w:val="24"/>
               </w:rPr>
               <w:t>Seed order placed by Wednesday, November 4.</w:t>
+            </w:r>
+          </w:p>
+          <w:p>
+            <w:pPr>
+              <w:spacing w:after="40" w:line="252" w:lineRule="auto"/>
+            </w:pPr>
+            <w:r>
+              <w:rPr>
+                <w:rFonts w:ascii="Times New Roman" w:hAnsi="Times New Roman" w:eastAsia="Times New Roman"/>
+                <w:b w:val="0"/>
+                <w:i w:val="0"/>
+                <w:sz w:val="24"/>
+              </w:rPr>
+              <w:t>Green space assessments complete by Friday, November 6.</w:t>
             </w:r>
           </w:p>
         </w:tc>
@@ -8310,7 +8936,7 @@
                 <w:i w:val="0"/>
                 <w:sz w:val="24"/>
               </w:rPr>
-              <w:t>• Tuesday, December 1 baseline record final and draft sent to the CPCs, with comments requested by noon on Thursday, December 3.</w:t>
+              <w:t>• Tuesday, December 1 baseline record final and draft sent to Dr. Dudley, with comments requested by noon on Thursday, December 3.</w:t>
             </w:r>
           </w:p>
           <w:p>
@@ -8400,7 +9026,7 @@
                 <w:i w:val="0"/>
                 <w:sz w:val="24"/>
               </w:rPr>
-              <w:t xml:space="preserve"> Report, recommendations, and handover folder delivered to both CPCs, and slides finished. All project activity ends.</w:t>
+              <w:t xml:space="preserve"> Report, recommendations, and handover folder delivered to Dr. Dudley, and slides finished. All project activity ends.</w:t>
             </w:r>
           </w:p>
           <w:p>
@@ -8624,7 +9250,7 @@
                 <w:i w:val="0"/>
                 <w:sz w:val="24"/>
               </w:rPr>
-              <w:t xml:space="preserve">Weekly email to both CPCs with all members copied, covering the work completed, challenges, questions, next steps, and a draft agenda. It is due </w:t>
+              <w:t xml:space="preserve">Weekly email to Dr. Dudley with all members copied, covering the work completed, challenges, questions, next steps, and a draft agenda. It is due </w:t>
             </w:r>
             <w:r>
               <w:rPr>
@@ -8869,7 +9495,7 @@
                 <w:i w:val="0"/>
                 <w:sz w:val="24"/>
               </w:rPr>
-              <w:t>Project Plan due on Avenue and emailed to both CPCs by 11.59 p.m.</w:t>
+              <w:t>Project Plan due on Avenue and emailed to Dr. Dudley by 11.59 p.m.</w:t>
             </w:r>
           </w:p>
         </w:tc>
@@ -9013,7 +9639,7 @@
                 <w:i w:val="0"/>
                 <w:sz w:val="24"/>
               </w:rPr>
-              <w:t>Friday, November 13</w:t>
+              <w:t>Friday, November 6</w:t>
             </w:r>
           </w:p>
         </w:tc>
@@ -9039,7 +9665,63 @@
                 <w:i w:val="0"/>
                 <w:sz w:val="24"/>
               </w:rPr>
-              <w:t>Design and planting plan (D3) and seed purchasing summary and seed record (D4) complete.</w:t>
+              <w:t>Assessments of all three green spaces complete.</w:t>
+            </w:r>
+          </w:p>
+        </w:tc>
+      </w:tr>
+      <w:tr>
+        <w:trPr>
+          <w:cantSplit w:val="true"/>
+        </w:trPr>
+        <w:tc>
+          <w:tcPr>
+            <w:tcW w:type="dxa" w:w="3312"/>
+            <w:tcMar>
+              <w:top w:w="60" w:type="dxa"/>
+              <w:left w:w="90" w:type="dxa"/>
+              <w:bottom w:w="60" w:type="dxa"/>
+              <w:right w:w="90" w:type="dxa"/>
+            </w:tcMar>
+            <w:shd w:val="clear" w:color="auto" w:fill="E6F0E9"/>
+          </w:tcPr>
+          <w:p>
+            <w:pPr>
+              <w:spacing w:after="40" w:line="252" w:lineRule="auto"/>
+            </w:pPr>
+            <w:r>
+              <w:rPr>
+                <w:rFonts w:ascii="Times New Roman" w:hAnsi="Times New Roman" w:eastAsia="Times New Roman"/>
+                <w:b/>
+                <w:i w:val="0"/>
+                <w:sz w:val="24"/>
+              </w:rPr>
+              <w:t>Friday, November 13</w:t>
+            </w:r>
+          </w:p>
+        </w:tc>
+        <w:tc>
+          <w:tcPr>
+            <w:tcW w:type="dxa" w:w="10512"/>
+            <w:tcMar>
+              <w:top w:w="60" w:type="dxa"/>
+              <w:left w:w="90" w:type="dxa"/>
+              <w:bottom w:w="60" w:type="dxa"/>
+              <w:right w:w="90" w:type="dxa"/>
+            </w:tcMar>
+          </w:tcPr>
+          <w:p>
+            <w:pPr>
+              <w:spacing w:after="40" w:line="252" w:lineRule="auto"/>
+            </w:pPr>
+            <w:r>
+              <w:rPr>
+                <w:rFonts w:ascii="Times New Roman" w:hAnsi="Times New Roman" w:eastAsia="Times New Roman"/>
+                <w:b w:val="0"/>
+                <w:i w:val="0"/>
+                <w:sz w:val="24"/>
+              </w:rPr>
+              <w:t>Site assessments and planting plan (D3) and seed purchasing summary and seed record (D4) complete.</w:t>
             </w:r>
           </w:p>
         </w:tc>
@@ -9083,6 +9765,7 @@
               <w:bottom w:w="60" w:type="dxa"/>
               <w:right w:w="90" w:type="dxa"/>
             </w:tcMar>
+            <w:shd w:val="clear" w:color="auto" w:fill="F7F9F7"/>
           </w:tcPr>
           <w:p>
             <w:pPr>
@@ -9139,7 +9822,6 @@
               <w:bottom w:w="60" w:type="dxa"/>
               <w:right w:w="90" w:type="dxa"/>
             </w:tcMar>
-            <w:shd w:val="clear" w:color="auto" w:fill="F7F9F7"/>
           </w:tcPr>
           <w:p>
             <w:pPr>
@@ -9152,7 +9834,7 @@
                 <w:i w:val="0"/>
                 <w:sz w:val="24"/>
               </w:rPr>
-              <w:t>Objective 2 complete with the plot seeded and mulched.</w:t>
+              <w:t>Objective 2 complete with three green spaces assessed and the helipad plot seeded and mulched.</w:t>
             </w:r>
           </w:p>
         </w:tc>
@@ -9196,6 +9878,7 @@
               <w:bottom w:w="60" w:type="dxa"/>
               <w:right w:w="90" w:type="dxa"/>
             </w:tcMar>
+            <w:shd w:val="clear" w:color="auto" w:fill="F7F9F7"/>
           </w:tcPr>
           <w:p>
             <w:pPr>
@@ -9208,7 +9891,7 @@
                 <w:i w:val="0"/>
                 <w:sz w:val="24"/>
               </w:rPr>
-              <w:t>Baseline and establishment record (D6) final and report draft sent to the CPCs.</w:t>
+              <w:t>Baseline and establishment record (D6) final and report draft sent to Dr. Dudley.</w:t>
             </w:r>
           </w:p>
         </w:tc>
@@ -9252,7 +9935,6 @@
               <w:bottom w:w="60" w:type="dxa"/>
               <w:right w:w="90" w:type="dxa"/>
             </w:tcMar>
-            <w:shd w:val="clear" w:color="auto" w:fill="F7F9F7"/>
           </w:tcPr>
           <w:p>
             <w:pPr>
@@ -9265,7 +9947,7 @@
                 <w:i w:val="0"/>
                 <w:sz w:val="24"/>
               </w:rPr>
-              <w:t>Final report, recommendations, and handover delivered to both CPCs (D7 and D8), and slides finished (D9). All project activity ends.</w:t>
+              <w:t>Final report, recommendations, and handover delivered to Dr. Dudley (D7 and D8), and slides finished (D9). All project activity ends.</w:t>
             </w:r>
           </w:p>
         </w:tc>
@@ -9309,6 +9991,7 @@
               <w:bottom w:w="60" w:type="dxa"/>
               <w:right w:w="90" w:type="dxa"/>
             </w:tcMar>
+            <w:shd w:val="clear" w:color="auto" w:fill="F7F9F7"/>
           </w:tcPr>
           <w:p>
             <w:pPr>
@@ -9366,7 +10049,6 @@
               <w:bottom w:w="60" w:type="dxa"/>
               <w:right w:w="90" w:type="dxa"/>
             </w:tcMar>
-            <w:shd w:val="clear" w:color="auto" w:fill="F7F9F7"/>
           </w:tcPr>
           <w:p>
             <w:pPr>
@@ -9798,7 +10480,7 @@
                 <w:i w:val="0"/>
                 <w:sz w:val="24"/>
               </w:rPr>
-              <w:t>• Sends the weekly email to the CPCs with all members copied.</w:t>
+              <w:t>• Sends the weekly email to Dr. Dudley with all members copied.</w:t>
             </w:r>
           </w:p>
           <w:p>
@@ -10081,7 +10763,7 @@
                 <w:i w:val="0"/>
                 <w:sz w:val="24"/>
               </w:rPr>
-              <w:t>• Walks the site and leads the design and planting plan (D3).</w:t>
+              <w:t>• Leads the three green space assessments and the planting plan (D3).</w:t>
             </w:r>
           </w:p>
           <w:p>
@@ -10252,7 +10934,7 @@
                 <w:i w:val="0"/>
                 <w:sz w:val="24"/>
               </w:rPr>
-              <w:t>• Leads the monitoring and expansion recommendations (D7).</w:t>
+              <w:t>• Leads the species recommendations and monitoring strategy (D7).</w:t>
             </w:r>
           </w:p>
           <w:p>
@@ -10362,7 +11044,7 @@
           <w:i w:val="0"/>
           <w:sz w:val="24"/>
         </w:rPr>
-        <w:t>Several tasks depend on another member's work, so we planned each handoff with a date. Marchelino needs Mehrshid's notes from the October 19 site walk and the CPCs' feedback on the criteria by October 23 to finish the framework. Mehrshid then needs the approved shortlist by October 30 to build the three mixes. Marchelino needs the mixes and seeding rates approved at the November 4 meeting, and the budget the CPCs gave in week 4, before placing the seed order that same day.</w:t>
+        <w:t>Several tasks depend on another member's work, so we planned each handoff with a date. Marchelino needs Mehrshid's notes from the October 19 site walk and Dr. Dudley's feedback on the criteria by October 23 to finish the framework. Mehrshid then needs the approved shortlist by October 30 to build the three mixes. Marchelino needs the mixes and seeding rates approved at the November 4 meeting, and the budget Dr. Dudley gave in week 4, before placing the seed order that same day.</w:t>
       </w:r>
     </w:p>
     <w:p>
@@ -10376,7 +11058,7 @@
           <w:i w:val="0"/>
           <w:sz w:val="24"/>
         </w:rPr>
-        <w:t>Planting depends on two outside partners. Nature @ McMaster prepares the plot and the CPCs supply the straw, and both need to be ready by November 18. Hadar asks for written confirmation of both on November 9 and checks again on November 16. After the event, Diya depends on everyone for photos, attendance, and measurements, which the whole group uploads to the shared folder within 24 hours. Finally, Hadar depends on Joseph, Marchelino, Mehrshid, and Diya for their report sections, which are due 24 hours before the Monday, November 30 draft.</w:t>
+        <w:t>Planting depends on two outside partners. Nature @ McMaster prepares the plot and Dr. Dudley supplies the straw, and both need to be ready by November 18. Hadar asks for written confirmation of both on November 9 and checks again on November 16. After the event, Diya depends on everyone for photos, attendance, and measurements, which the whole group uploads to the shared folder within 24 hours. Finally, Hadar depends on Joseph, Marchelino, Mehrshid, and Diya for their report sections, which are due 24 hours before the Monday, November 30 draft.</w:t>
       </w:r>
     </w:p>
     <w:p>
@@ -10472,7 +11154,7 @@
           <w:i w:val="0"/>
           <w:sz w:val="24"/>
         </w:rPr>
-        <w:t>Our Microsoft Teams group chat is our main channel for updates, questions, and reminders. Our shared Google Drive folder holds one version of every file, and McMaster email is used for anything sent to the CPCs or Nature @ McMaster, with all five members copied. Each member replies in Teams within 24 hours, and anyone who needs more time to reply or to finish a task says so in the chat. A message marked URGENT needs a reply within 6 hours.</w:t>
+        <w:t>Our Microsoft Teams group chat is our main channel for updates, questions, and reminders. Our shared Google Drive folder holds one version of every file, and McMaster email is used for anything sent to Dr. Dudley or Nature @ McMaster, with all five members copied. Each member replies in Teams within 24 hours, and anyone who needs more time to reply or to finish a task says so in the chat. A message marked URGENT needs a reply within 6 hours.</w:t>
       </w:r>
     </w:p>
     <w:p>
@@ -10486,7 +11168,7 @@
           <w:i w:val="0"/>
           <w:sz w:val="24"/>
         </w:rPr>
-        <w:t>Hadar sends the weekly email to the CPCs with all members copied. It covers the work completed, any challenges, our questions, the next steps, and a draft agenda for the next meeting. Nathan Butterworth, who helps with scheduling, is copied when we arrange meeting times. Meeting notes are posted in Teams within 24 hours, decisions go in the decision log, and each member posts a short status update every Friday. We stay respectful, stay open to feedback, and tell the group early about any problem that could affect our work.</w:t>
+        <w:t>Hadar sends the weekly email to Dr. Dudley with all members copied. It covers the work completed, any challenges, our questions, the next steps, and a draft agenda for the next meeting. Nathan Butterworth, who helps with scheduling, is copied when we arrange meeting times. Meeting notes are posted in Teams within 24 hours, decisions go in the decision log, and each member posts a short status update every Friday. We stay respectful, stay open to feedback, and tell the group early about any problem that could affect our work.</w:t>
       </w:r>
     </w:p>
     <w:p>
@@ -10517,7 +11199,7 @@
           <w:i w:val="0"/>
           <w:sz w:val="24"/>
         </w:rPr>
-        <w:t>We meet every Wednesday at 10.45 a.m., which is also the weekly time Dr. Dudley confirmed with us, so most meetings start with her and then continue as group work time. Hadar posts the agenda 24 hours ahead. Each meeting reviews completed work, checks the timeline and the risks, discusses challenges, and assigns next steps. Note taking rotates each week, and Hadar posts the notes.</w:t>
+        <w:t>We meet every Wednesday at 10.45 a.m., which is also the weekly time Dr. Dudley confirmed with us, so most meetings start with Dr. Dudley and then continue as group work time. Hadar posts the agenda 24 hours ahead. Each meeting reviews completed work, checks the timeline and the risks, discusses challenges, and assigns next steps. Note taking rotates each week, and Hadar posts the notes.</w:t>
       </w:r>
     </w:p>
     <w:p>
@@ -10652,7 +11334,7 @@
           <w:i w:val="0"/>
           <w:sz w:val="24"/>
         </w:rPr>
-        <w:t>Some decisions need more than a vote. Any change to the objectives, the deliverables, the site, the species and mixes, the budget, or the planting dates needs the agreement of all five members and a written yes from the relevant CPC. If one of these decisions is still split after a second discussion, the member who disagrees explains what would change their mind, and we take the options to Dr. Dudley at the next CPC meeting and follow her advice. Until then the current plan stays in place. We will ask both CPCs to approve the November 28 backup date during week 8, so moving to it on November 18 only needs the five of us to agree.</w:t>
+        <w:t>Some decisions need more than a vote. Any change to the objectives, the deliverables, the site, the species and mixes, the budget, or the planting dates needs the agreement of all five members and a written yes from Dr. Dudley. If one of these decisions is still split after a second discussion, the member who disagrees explains what would change their mind, and we take the options to Dr. Dudley at the next CPC meeting and follow that advice. Until then the current plan stays in place. We will ask Dr. Dudley to approve the November 28 backup date during week 8, so moving to it on November 18 only needs the five of us to agree.</w:t>
       </w:r>
     </w:p>
     <w:p>
@@ -10697,7 +11379,7 @@
           <w:i w:val="0"/>
           <w:sz w:val="24"/>
         </w:rPr>
-        <w:t>The lead for an assignment finishes a draft at least 72 hours before the deadline. Each member then reviews the full assignment and not only their own section, checking it against the rubric, the word limits, the citation style, the formatting, and the accuracy of the information. Edits are finished 48 hours before the deadline. When a draft goes to the CPCs for comments, the same 48 hour rule applies to that draft, and their comments are added the day before the deadline.</w:t>
+        <w:t>The lead for an assignment finishes a draft at least 72 hours before the deadline. Each member then reviews the full assignment and not only their own section, checking it against the rubric, the word limits, the citation style, the formatting, and the accuracy of the information. Edits are finished 48 hours before the deadline. When a draft goes to Dr. Dudley for comments, the same 48 hour rule applies to that draft, and their comments are added the day before the deadline.</w:t>
       </w:r>
     </w:p>
     <w:p>
@@ -10711,7 +11393,7 @@
           <w:i w:val="0"/>
           <w:sz w:val="24"/>
         </w:rPr>
-        <w:t>Before upload, each member replies in Teams that they approve the final PDF. Hadar then submits it on Avenue, with Joseph as backup if Hadar is unavailable, and posts a screenshot of the Avenue confirmation in Teams. For the project plan, the same PDF is emailed to both CPCs with all members copied before the deadline, and the screenshot of that email is added to the plan.</w:t>
+        <w:t>Before upload, each member replies in Teams that they approve the final PDF. Hadar then submits it on Avenue, with Joseph as backup if Hadar is unavailable, and posts a screenshot of the Avenue confirmation in Teams. For the project plan, the same PDF is emailed to Dr. Dudley with all members copied before the deadline, and the screenshot of that email is added to the plan.</w:t>
       </w:r>
     </w:p>
     <w:p>
@@ -10801,7 +11483,7 @@
           <w:i w:val="0"/>
           <w:sz w:val="24"/>
         </w:rPr>
-        <w:t>If the problem continues after two weeks or starts to affect our progress, we ask the TA for guidance, and the instructor is the final step. Concerns about how members work together stay inside the group until we reach the TA or instructor step. We focus on the issue and not on blaming people, and we check back one week after any agreement to see whether it worked. When a concern is about project expectations or the work on site, we may also consult the CPCs. A conflict with a CPC or partner is raised with the group first and then handled by Hadar politely and in writing, or by Joseph if the conflict involves Hadar. Any agreed change in responsibilities is shared with everyone affected.</w:t>
+        <w:t>If the problem continues after two weeks or starts to affect our progress, we ask the TA for guidance, and the instructor is the final step. Concerns about how members work together stay inside the group until we reach the TA or instructor step. We focus on the issue and not on blaming people, and we check back one week after any agreement to see whether it worked. When a concern is about project expectations or the work on site, we may also consult Dr. Dudley. A conflict with a CPC or partner is raised with the group first and then handled by Hadar politely and in writing, or by Joseph if the conflict involves Hadar. Any agreed change in responsibilities is shared with everyone affected.</w:t>
       </w:r>
     </w:p>
     <w:p>
@@ -11166,7 +11848,7 @@
           <w:i w:val="0"/>
           <w:sz w:val="24"/>
         </w:rPr>
-        <w:t>The site could change after Dr. Dudley talks with grounds staff, Nature @ McMaster and Facility Services may not have the plot ready in time, or with two CPCs and a grounds team involved we could miss an instruction or receive two that conflict. We rate this risk as medium likelihood and high impact, and Hadar owns it.</w:t>
+        <w:t>The site could change after Dr. Dudley talks with grounds staff, Nature @ McMaster and Facility Services may not have the plot ready in time, or with our CPC, Nature @ McMaster, and a grounds team involved we could miss an instruction or receive two that conflict. We rate this risk as medium likelihood and high impact, and Hadar owns it.</w:t>
       </w:r>
     </w:p>
     <w:p>
@@ -11189,7 +11871,7 @@
           <w:i w:val="0"/>
           <w:sz w:val="24"/>
         </w:rPr>
-        <w:t xml:space="preserve"> We draw the layout so it can shift to another open area without redesigning the experiment. We confirm the site and plot size in writing at the site visit by October 23, and we ask for plot readiness in writing on November 9 and again on November 16. Hadar sends all email to the CPCs and Nature @ McMaster with every member copied, any member who speaks with a partner or supplier reports back in Teams the same day, meeting notes go to both CPCs within 24 hours, and we ask for a written yes on any change to the site, species, budget, or dates. If the plot is not ready by November 18, we move to the November 28 backup date, which the CPCs will already have approved in week 8.</w:t>
+        <w:t xml:space="preserve"> We draw the layout so it can shift to another open area without redesigning the experiment. We confirm the site and plot size in writing at the site visit by October 23, and we ask for plot readiness in writing on November 9 and again on November 16. Hadar sends all email to Dr. Dudley and Nature @ McMaster with every member copied, any member who speaks with a partner or supplier reports back in Teams the same day, meeting notes go to Dr. Dudley within 24 hours, and we ask for a written yes on any change to the site, species, budget, or dates. If the plot is not ready by November 18, we move to the November 28 backup date, which Dr. Dudley will already have approved in week 8.</w:t>
       </w:r>
     </w:p>
     <w:p>
@@ -11220,7 +11902,7 @@
           <w:i w:val="0"/>
           <w:sz w:val="24"/>
         </w:rPr>
-        <w:t>Native seed can sell out by late fall, it may cost more than the CPCs can cover, delivery could be slow, and some wildflower mixes sold as native still contain plants that are not. We rate this risk as medium likelihood and medium impact, and Marchelino owns it.</w:t>
+        <w:t>Native seed can sell out by late fall, it may cost more than the project budget can cover, delivery could be slow, and some wildflower mixes sold as native still contain plants that are not. We rate this risk as medium likelihood and medium impact, and Marchelino owns it.</w:t>
       </w:r>
     </w:p>
     <w:p>
@@ -11243,7 +11925,7 @@
           <w:i w:val="0"/>
           <w:sz w:val="24"/>
         </w:rPr>
-        <w:t xml:space="preserve"> At the October 14 meeting we ask the CPCs for a budget figure and for who places and pays for the order, so that no member pays out of pocket and the cost score in the framework uses real limits. Seed availability and cost are part of the evaluation framework, so we avoid species we cannot buy. We ask at least two suppliers for quotes, stock, and delivery dates by October 30, and we read every species list on a mix label and reject mixes that include plants that are not native to Ontario. We order by Wednesday, November 4 and ask for delivery or local pickup by November 13. If the seed has not arrived by Monday, November 16, Marchelino proposes the closest substitute from the ranked backup list in D2, and once the group and Dr. Dudley agree in writing, it is bought from a local supplier, or we move to the November 28 date. If money runs short, we shrink the subplots before dropping a mix, so all three mixes are still tested.</w:t>
+        <w:t xml:space="preserve"> At the October 14 meeting we ask Dr. Dudley for a budget figure and for who places and pays for the order, so that no member pays out of pocket and the cost score in the framework uses real limits. Seed availability and cost are part of the evaluation framework, so we avoid species we cannot buy. We ask at least two suppliers for quotes, stock, and delivery dates by October 30, and we read every species list on a mix label and reject mixes that include plants that are not native to Ontario. We order by Wednesday, November 4 and ask for delivery or local pickup by November 13. If the seed has not arrived by Monday, November 16, Marchelino proposes the closest substitute from the ranked backup list in D2, and once the group and Dr. Dudley agree in writing, it is bought from a local supplier, or we move to the November 28 date. If money runs short, we shrink the subplots before dropping a mix, so all three mixes are still tested.</w:t>
       </w:r>
     </w:p>
     <w:p>
@@ -11297,7 +11979,7 @@
           <w:i w:val="0"/>
           <w:sz w:val="24"/>
         </w:rPr>
-        <w:t xml:space="preserve"> At the site visit we ask Facility Services and the CPCs how far the plot must be from the landing area, whether loose straw is allowed there, and who we contact on planting day. If loose straw is not allowed, we ask the CPCs about a biodegradable erosion blanket pinned over the seed instead. By October 30 we also ask whether volunteers need a waiver or any McMaster approval. On planting day one member watches for helicopters, and everyone moves off the plot until each landing is over. Work runs from 10 a.m. to 1 p.m. so that we finish well before dark, and the planting plan lists warm clothing, gloves, and closed footwear for everyone.</w:t>
+        <w:t xml:space="preserve"> At the site visit we ask Facility Services and Dr. Dudley how far the plot must be from the landing area, whether loose straw is allowed there, and who we contact on planting day. If loose straw is not allowed, we ask Dr. Dudley about a biodegradable erosion blanket pinned over the seed instead. By October 30 we also ask whether volunteers need a waiver or any McMaster approval. On planting day one member watches for helicopters, and everyone moves off the plot until each landing is over. Work runs from 10 a.m. to 1 p.m. so that we finish well before dark, and the planting plan lists warm clothing, gloves, and closed footwear for everyone.</w:t>
       </w:r>
     </w:p>
     <w:p>
@@ -11405,7 +12087,7 @@
           <w:i w:val="0"/>
           <w:sz w:val="24"/>
         </w:rPr>
-        <w:t xml:space="preserve"> We place the plot away from the paths people already use, which we check at the site walk. With approval from the CPCs and Facility Services, we mark the plot with stakes and rope and a small sign that explains the project. We mark every subplot corner with metal stakes set flush with the ground and record GPS points, so the subplots can be found even if the surface markers are removed. We also ask Facility Services in writing to keep mowers, snow piles, and salt off the plot until spring.</w:t>
+        <w:t xml:space="preserve"> We place the plot away from the paths people already use, which we check at the site walk. With approval from Dr. Dudley and Facility Services, we mark the plot with stakes and rope and a small sign that explains the project. We mark every subplot corner with metal stakes set flush with the ground and record GPS points, so the subplots can be found even if the surface markers are removed. We also ask Facility Services in writing to keep mowers, snow piles, and salt off the plot until spring.</w:t>
       </w:r>
     </w:p>
     <w:p>
@@ -11459,7 +12141,7 @@
           <w:i w:val="0"/>
           <w:sz w:val="24"/>
         </w:rPr>
-        <w:t xml:space="preserve"> We ask the CPCs for clean straw that is free of weed and grain seed, and we only buy seed with a full species list. Joseph researches the main weed threats for these mixes as part of the literature review, and the monitoring protocol includes weed cover and a simple spring weeding schedule that we ask Nature @ McMaster to follow. The turf control subplots also show how much weed pressure the site has without any change in planting.</w:t>
+        <w:t xml:space="preserve"> We ask Dr. Dudley for clean straw that is free of weed and grain seed, and we only buy seed with a full species list. Joseph researches the main weed threats for these mixes as part of the literature review, and the monitoring protocol includes weed cover and a simple spring weeding schedule that we ask Nature @ McMaster to follow. The turf control subplots also show how much weed pressure the site has without any change in planting.</w:t>
       </w:r>
     </w:p>
     <w:p>
@@ -11601,7 +12283,7 @@
           <w:i w:val="0"/>
           <w:sz w:val="24"/>
         </w:rPr>
-        <w:t>The completed plan was saved as a PDF and emailed to both CPCs on Friday, October 9, 2026, before the 11.59 p.m. deadline. The email went to Dr. Susan Dudley and Wayne Terryberry, copied all five group members, and had the plan attached as a PDF.</w:t>
+        <w:t>The completed plan was saved as a PDF and emailed to our CPC, Dr. Susan Dudley, with all five group members copied and the plan attached as a PDF.</w:t>
       </w:r>
     </w:p>
     <w:p>
@@ -11630,7 +12312,7 @@
           <w:sz w:val="24"/>
           <w:highlight w:val="yellow"/>
         </w:rPr>
-        <w:t>[Insert a screenshot of the sent email here. It must show both CPCs as recipients, all five members copied, the date and time sent, and the plan attached as a PDF.]</w:t>
+        <w:t>[Insert a screenshot of the sent email here. It must show Dr. Dudley as the recipient, all five members copied, the date and time sent, and the plan attached as a PDF.]</w:t>
       </w:r>
     </w:p>
     <w:p>

</xml_diff>